<commit_message>
fix(task1.2): add missing a' value; refactor(task4.1c): replace if block with step decrement
</commit_message>
<xml_diff>
--- a/jsBasics/4. Циклы_ while, do…while, for, for in, for of. Директивы break, continue.docx
+++ b/jsBasics/4. Циклы_ while, do…while, for, for in, for of. Директивы break, continue.docx
@@ -1777,7 +1777,7 @@
         </w:pBdr>
         <w:shd w:fill="auto" w:val="clear"/>
         <w:spacing w:after="0" w:before="0" w:line="276" w:lineRule="auto"/>
-        <w:ind w:left="2160" w:right="0" w:hanging="285"/>
+        <w:ind w:left="1440" w:right="0" w:firstLine="0"/>
         <w:jc w:val="left"/>
         <w:rPr>
           <w:sz w:val="24"/>
@@ -1790,15 +1790,23 @@
           <w:szCs w:val="24"/>
           <w:rtl w:val="0"/>
         </w:rPr>
-        <w:t xml:space="preserve">if</w:t>
-      </w:r>
-      <w:r>
-        <w:rPr>
-          <w:sz w:val="24"/>
-          <w:szCs w:val="24"/>
-          <w:rtl w:val="0"/>
-        </w:rPr>
-        <w:t xml:space="preserve"> </w:t>
+        <w:t xml:space="preserve">console</w:t>
+      </w:r>
+      <w:r>
+        <w:rPr>
+          <w:sz w:val="24"/>
+          <w:szCs w:val="24"/>
+          <w:rtl w:val="0"/>
+        </w:rPr>
+        <w:t xml:space="preserve">.</w:t>
+      </w:r>
+      <w:r>
+        <w:rPr>
+          <w:sz w:val="24"/>
+          <w:szCs w:val="24"/>
+          <w:rtl w:val="0"/>
+        </w:rPr>
+        <w:t xml:space="preserve">log</w:t>
       </w:r>
       <w:r>
         <w:rPr>
@@ -1814,87 +1822,15 @@
           <w:szCs w:val="24"/>
           <w:rtl w:val="0"/>
         </w:rPr>
-        <w:t xml:space="preserve">i </w:t>
-      </w:r>
-      <w:r>
-        <w:rPr>
-          <w:sz w:val="24"/>
-          <w:szCs w:val="24"/>
-          <w:rtl w:val="0"/>
-        </w:rPr>
-        <w:t xml:space="preserve">%</w:t>
-      </w:r>
-      <w:r>
-        <w:rPr>
-          <w:sz w:val="24"/>
-          <w:szCs w:val="24"/>
-          <w:rtl w:val="0"/>
-        </w:rPr>
-        <w:t xml:space="preserve"> </w:t>
-      </w:r>
-      <w:r>
-        <w:rPr>
-          <w:sz w:val="24"/>
-          <w:szCs w:val="24"/>
-          <w:rtl w:val="0"/>
-        </w:rPr>
-        <w:t xml:space="preserve">2</w:t>
-      </w:r>
-      <w:r>
-        <w:rPr>
-          <w:sz w:val="24"/>
-          <w:szCs w:val="24"/>
-          <w:rtl w:val="0"/>
-        </w:rPr>
-        <w:t xml:space="preserve"> </w:t>
-      </w:r>
-      <w:r>
-        <w:rPr>
-          <w:sz w:val="24"/>
-          <w:szCs w:val="24"/>
-          <w:rtl w:val="0"/>
-        </w:rPr>
-        <w:t xml:space="preserve">===</w:t>
-      </w:r>
-      <w:r>
-        <w:rPr>
-          <w:sz w:val="24"/>
-          <w:szCs w:val="24"/>
-          <w:rtl w:val="0"/>
-        </w:rPr>
-        <w:t xml:space="preserve"> </w:t>
-      </w:r>
-      <w:r>
-        <w:rPr>
-          <w:sz w:val="24"/>
-          <w:szCs w:val="24"/>
-          <w:rtl w:val="0"/>
-        </w:rPr>
-        <w:t xml:space="preserve">0</w:t>
-      </w:r>
-      <w:r>
-        <w:rPr>
-          <w:sz w:val="24"/>
-          <w:szCs w:val="24"/>
-          <w:rtl w:val="0"/>
-        </w:rPr>
-        <w:t xml:space="preserve">)</w:t>
-      </w:r>
-      <w:r>
-        <w:rPr>
-          <w:sz w:val="24"/>
-          <w:szCs w:val="24"/>
-          <w:rtl w:val="0"/>
-        </w:rPr>
-        <w:t xml:space="preserve"> </w:t>
-      </w:r>
-      <w:r>
-        <w:rPr>
-          <w:sz w:val="24"/>
-          <w:szCs w:val="24"/>
-          <w:rtl w:val="0"/>
-        </w:rPr>
-        <w:t xml:space="preserve">{</w:t>
+        <w:t xml:space="preserve">i</w:t>
+      </w:r>
+      <w:r>
+        <w:rPr>
+          <w:sz w:val="24"/>
+          <w:szCs w:val="24"/>
+          <w:rtl w:val="0"/>
+        </w:rPr>
+        <w:t xml:space="preserve">);</w:t>
       </w:r>
     </w:p>
     <w:p>
@@ -1912,7 +1848,7 @@
         </w:pBdr>
         <w:shd w:fill="auto" w:val="clear"/>
         <w:spacing w:after="0" w:before="0" w:line="276" w:lineRule="auto"/>
-        <w:ind w:left="1440" w:right="0" w:firstLine="720"/>
+        <w:ind w:left="1440" w:right="0" w:firstLine="0"/>
         <w:jc w:val="left"/>
         <w:rPr>
           <w:sz w:val="24"/>
@@ -1925,143 +1861,7 @@
           <w:szCs w:val="24"/>
           <w:rtl w:val="0"/>
         </w:rPr>
-        <w:t xml:space="preserve">console</w:t>
-      </w:r>
-      <w:r>
-        <w:rPr>
-          <w:sz w:val="24"/>
-          <w:szCs w:val="24"/>
-          <w:rtl w:val="0"/>
-        </w:rPr>
-        <w:t xml:space="preserve">.</w:t>
-      </w:r>
-      <w:r>
-        <w:rPr>
-          <w:sz w:val="24"/>
-          <w:szCs w:val="24"/>
-          <w:rtl w:val="0"/>
-        </w:rPr>
-        <w:t xml:space="preserve">log</w:t>
-      </w:r>
-      <w:r>
-        <w:rPr>
-          <w:sz w:val="24"/>
-          <w:szCs w:val="24"/>
-          <w:rtl w:val="0"/>
-        </w:rPr>
-        <w:t xml:space="preserve">(</w:t>
-      </w:r>
-      <w:r>
-        <w:rPr>
-          <w:sz w:val="24"/>
-          <w:szCs w:val="24"/>
-          <w:rtl w:val="0"/>
-        </w:rPr>
-        <w:t xml:space="preserve">i</w:t>
-      </w:r>
-      <w:r>
-        <w:rPr>
-          <w:sz w:val="24"/>
-          <w:szCs w:val="24"/>
-          <w:rtl w:val="0"/>
-        </w:rPr>
-        <w:t xml:space="preserve">);</w:t>
-      </w:r>
-      <w:r>
-        <w:rPr>
-          <w:rtl w:val="0"/>
-        </w:rPr>
-      </w:r>
-    </w:p>
-    <w:p>
-      <w:pPr>
-        <w:keepNext w:val="0"/>
-        <w:keepLines w:val="0"/>
-        <w:pageBreakBefore w:val="0"/>
-        <w:widowControl w:val="1"/>
-        <w:pBdr>
-          <w:top w:space="0" w:sz="0" w:val="nil"/>
-          <w:left w:space="0" w:sz="0" w:val="nil"/>
-          <w:bottom w:space="0" w:sz="0" w:val="nil"/>
-          <w:right w:space="0" w:sz="0" w:val="nil"/>
-          <w:between w:space="0" w:sz="0" w:val="nil"/>
-        </w:pBdr>
-        <w:shd w:fill="auto" w:val="clear"/>
-        <w:spacing w:after="0" w:before="0" w:line="276" w:lineRule="auto"/>
-        <w:ind w:left="1440" w:right="0" w:hanging="285"/>
-        <w:jc w:val="left"/>
-        <w:rPr>
-          <w:sz w:val="24"/>
-          <w:szCs w:val="24"/>
-        </w:rPr>
-      </w:pPr>
-      <w:r>
-        <w:rPr>
-          <w:sz w:val="24"/>
-          <w:szCs w:val="24"/>
-          <w:rtl w:val="0"/>
-        </w:rPr>
-        <w:t xml:space="preserve">  </w:t>
-      </w:r>
-      <w:r>
-        <w:rPr>
-          <w:sz w:val="24"/>
-          <w:szCs w:val="24"/>
-          <w:rtl w:val="0"/>
-        </w:rPr>
-        <w:t xml:space="preserve">}</w:t>
-      </w:r>
-      <w:r>
-        <w:rPr>
-          <w:rtl w:val="0"/>
-        </w:rPr>
-      </w:r>
-    </w:p>
-    <w:p>
-      <w:pPr>
-        <w:keepNext w:val="0"/>
-        <w:keepLines w:val="0"/>
-        <w:pageBreakBefore w:val="0"/>
-        <w:widowControl w:val="1"/>
-        <w:pBdr>
-          <w:top w:space="0" w:sz="0" w:val="nil"/>
-          <w:left w:space="0" w:sz="0" w:val="nil"/>
-          <w:bottom w:space="0" w:sz="0" w:val="nil"/>
-          <w:right w:space="0" w:sz="0" w:val="nil"/>
-          <w:between w:space="0" w:sz="0" w:val="nil"/>
-        </w:pBdr>
-        <w:shd w:fill="auto" w:val="clear"/>
-        <w:spacing w:after="0" w:before="0" w:line="276" w:lineRule="auto"/>
-        <w:ind w:left="1440" w:right="0" w:hanging="285"/>
-        <w:jc w:val="left"/>
-        <w:rPr>
-          <w:sz w:val="24"/>
-          <w:szCs w:val="24"/>
-        </w:rPr>
-      </w:pPr>
-      <w:r>
-        <w:rPr>
-          <w:sz w:val="24"/>
-          <w:szCs w:val="24"/>
-          <w:rtl w:val="0"/>
-        </w:rPr>
-        <w:t xml:space="preserve">  i</w:t>
-      </w:r>
-      <w:r>
-        <w:rPr>
-          <w:sz w:val="24"/>
-          <w:szCs w:val="24"/>
-          <w:rtl w:val="0"/>
-        </w:rPr>
-        <w:t xml:space="preserve">--</w:t>
-      </w:r>
-      <w:r>
-        <w:rPr>
-          <w:sz w:val="24"/>
-          <w:szCs w:val="24"/>
-          <w:rtl w:val="0"/>
-        </w:rPr>
-        <w:t xml:space="preserve">;</w:t>
+        <w:t xml:space="preserve">i -= 2;</w:t>
       </w:r>
       <w:r>
         <w:rPr>

</xml_diff>